<commit_message>
complete week 14 report
</commit_message>
<xml_diff>
--- a/Documentation/Weekly Report/week14/CMSC-4920-Week14Report-Group2.docx
+++ b/Documentation/Weekly Report/week14/CMSC-4920-Week14Report-Group2.docx
@@ -1351,27 +1351,7 @@
         <w:rPr>
           <w:rFonts w:ascii="Times New Roman" w:hAnsi="Times New Roman" w:cs="Times New Roman"/>
         </w:rPr>
-        <w:t xml:space="preserve">During our final week of progress, our team prepared for the upcoming Advisory Board meeting. This included final debugging, user manual </w:t>
-      </w:r>
-      <w:proofErr w:type="gramStart"/>
-      <w:r>
-        <w:rPr>
-          <w:rFonts w:ascii="Times New Roman" w:hAnsi="Times New Roman" w:cs="Times New Roman"/>
-        </w:rPr>
-        <w:t>pick</w:t>
-      </w:r>
-      <w:proofErr w:type="gramEnd"/>
-      <w:r>
-        <w:rPr>
-          <w:rFonts w:ascii="Times New Roman" w:hAnsi="Times New Roman" w:cs="Times New Roman"/>
-        </w:rPr>
-        <w:t xml:space="preserve"> up from print shop, and timed demonstration practices</w:t>
-      </w:r>
-      <w:r>
-        <w:rPr>
-          <w:rFonts w:ascii="Times New Roman" w:hAnsi="Times New Roman" w:cs="Times New Roman"/>
-        </w:rPr>
-        <w:t>.</w:t>
+        <w:t>During our final week of progress, our team prepared for the upcoming Advisory Board meeting. This included final debugging, user manual pick up from print shop, and timed demonstration practices.</w:t>
       </w:r>
     </w:p>
     <w:p>
@@ -1609,6 +1589,69 @@
     <w:p>
       <w:pPr>
         <w:spacing w:line="480" w:lineRule="auto"/>
+        <w:ind w:firstLine="720"/>
+        <w:rPr>
+          <w:rFonts w:ascii="Times New Roman" w:hAnsi="Times New Roman" w:cs="Times New Roman"/>
+        </w:rPr>
+      </w:pPr>
+      <w:r>
+        <w:rPr>
+          <w:rFonts w:ascii="Times New Roman" w:hAnsi="Times New Roman" w:cs="Times New Roman"/>
+        </w:rPr>
+        <w:t>Solutions that were found for this week</w:t>
+      </w:r>
+      <w:r>
+        <w:rPr>
+          <w:rFonts w:ascii="Times New Roman" w:hAnsi="Times New Roman" w:cs="Times New Roman"/>
+        </w:rPr>
+        <w:t>’</w:t>
+      </w:r>
+      <w:r>
+        <w:rPr>
+          <w:rFonts w:ascii="Times New Roman" w:hAnsi="Times New Roman" w:cs="Times New Roman"/>
+        </w:rPr>
+        <w:t>s</w:t>
+      </w:r>
+      <w:r>
+        <w:rPr>
+          <w:rFonts w:ascii="Times New Roman" w:hAnsi="Times New Roman" w:cs="Times New Roman"/>
+        </w:rPr>
+        <w:t xml:space="preserve"> challenges are</w:t>
+      </w:r>
+      <w:r>
+        <w:rPr>
+          <w:rFonts w:ascii="Times New Roman" w:hAnsi="Times New Roman" w:cs="Times New Roman"/>
+        </w:rPr>
+        <w:t xml:space="preserve"> </w:t>
+      </w:r>
+      <w:r>
+        <w:rPr>
+          <w:rFonts w:ascii="Times New Roman" w:hAnsi="Times New Roman" w:cs="Times New Roman"/>
+        </w:rPr>
+        <w:t>represented by the following.</w:t>
+      </w:r>
+      <w:r>
+        <w:rPr>
+          <w:rFonts w:ascii="Times New Roman" w:hAnsi="Times New Roman" w:cs="Times New Roman"/>
+        </w:rPr>
+        <w:t xml:space="preserve"> Git logs were tracked to find missing code due to merge conflict. </w:t>
+      </w:r>
+      <w:r>
+        <w:rPr>
+          <w:rFonts w:ascii="Times New Roman" w:hAnsi="Times New Roman" w:cs="Times New Roman"/>
+        </w:rPr>
+        <w:t xml:space="preserve">This history allowed us to go back and find what pieces were missing and re-add them to the current working code branch. </w:t>
+      </w:r>
+      <w:r>
+        <w:rPr>
+          <w:rFonts w:ascii="Times New Roman" w:hAnsi="Times New Roman" w:cs="Times New Roman"/>
+        </w:rPr>
+        <w:t>The solution to presentation timing conflicts was to schedule additional practices next week to ensure proper preparation.</w:t>
+      </w:r>
+    </w:p>
+    <w:p>
+      <w:pPr>
+        <w:spacing w:line="480" w:lineRule="auto"/>
         <w:rPr>
           <w:rFonts w:ascii="Times New Roman" w:hAnsi="Times New Roman" w:cs="Times New Roman"/>
           <w:b/>
@@ -1627,72 +1670,47 @@
     <w:p>
       <w:pPr>
         <w:spacing w:line="480" w:lineRule="auto"/>
-        <w:rPr>
-          <w:rFonts w:ascii="Times New Roman" w:hAnsi="Times New Roman" w:cs="Times New Roman"/>
-          <w:b/>
-          <w:bCs/>
-        </w:rPr>
-      </w:pPr>
-    </w:p>
-    <w:p>
-      <w:pPr>
-        <w:spacing w:line="480" w:lineRule="auto"/>
-        <w:rPr>
-          <w:rFonts w:ascii="Times New Roman" w:hAnsi="Times New Roman" w:cs="Times New Roman"/>
-          <w:b/>
-          <w:bCs/>
-        </w:rPr>
-      </w:pPr>
-    </w:p>
-    <w:p>
-      <w:pPr>
-        <w:spacing w:line="480" w:lineRule="auto"/>
-        <w:rPr>
-          <w:rFonts w:ascii="Times New Roman" w:hAnsi="Times New Roman" w:cs="Times New Roman"/>
-          <w:b/>
-          <w:bCs/>
-        </w:rPr>
-      </w:pPr>
-    </w:p>
-    <w:p>
-      <w:pPr>
-        <w:spacing w:line="480" w:lineRule="auto"/>
-        <w:rPr>
-          <w:rFonts w:ascii="Times New Roman" w:hAnsi="Times New Roman" w:cs="Times New Roman"/>
-          <w:b/>
-          <w:bCs/>
-        </w:rPr>
-      </w:pPr>
-    </w:p>
-    <w:p>
-      <w:pPr>
-        <w:spacing w:line="480" w:lineRule="auto"/>
-        <w:rPr>
-          <w:rFonts w:ascii="Times New Roman" w:hAnsi="Times New Roman" w:cs="Times New Roman"/>
-          <w:b/>
-          <w:bCs/>
-        </w:rPr>
-      </w:pPr>
-    </w:p>
-    <w:p>
-      <w:pPr>
-        <w:spacing w:line="480" w:lineRule="auto"/>
-        <w:rPr>
-          <w:rFonts w:ascii="Times New Roman" w:hAnsi="Times New Roman" w:cs="Times New Roman"/>
-          <w:b/>
-          <w:bCs/>
-        </w:rPr>
-      </w:pPr>
-    </w:p>
-    <w:p>
-      <w:pPr>
-        <w:spacing w:line="480" w:lineRule="auto"/>
-        <w:rPr>
-          <w:rFonts w:ascii="Times New Roman" w:hAnsi="Times New Roman" w:cs="Times New Roman"/>
-          <w:b/>
-          <w:bCs/>
-        </w:rPr>
-      </w:pPr>
+        <w:ind w:firstLine="720"/>
+        <w:rPr>
+          <w:rFonts w:ascii="Times New Roman" w:hAnsi="Times New Roman" w:cs="Times New Roman"/>
+        </w:rPr>
+      </w:pPr>
+      <w:r>
+        <w:rPr>
+          <w:rFonts w:ascii="Times New Roman" w:hAnsi="Times New Roman" w:cs="Times New Roman"/>
+        </w:rPr>
+        <w:t xml:space="preserve">Team progress </w:t>
+      </w:r>
+      <w:r>
+        <w:rPr>
+          <w:rFonts w:ascii="Times New Roman" w:hAnsi="Times New Roman" w:cs="Times New Roman"/>
+        </w:rPr>
+        <w:t xml:space="preserve">followed the same consistency as other weeks did, however, additional time and effort was put in. This was to make sure that all documentation was proper, spell checked and prepared for upcoming submission. The wrap-up list in D2l was properly consulted to check that each </w:t>
+      </w:r>
+      <w:r>
+        <w:rPr>
+          <w:rFonts w:ascii="Times New Roman" w:hAnsi="Times New Roman" w:cs="Times New Roman"/>
+        </w:rPr>
+        <w:t>milestone has been reached. The user manual, both hard copy and code listing have been completed. The description paragraph has been prepared.</w:t>
+      </w:r>
+      <w:r>
+        <w:rPr>
+          <w:rFonts w:ascii="Times New Roman" w:hAnsi="Times New Roman" w:cs="Times New Roman"/>
+        </w:rPr>
+        <w:t xml:space="preserve"> Final stages are preparing code for submission and attending final practices. Our team semester Gantt chart can now be declared completed</w:t>
+      </w:r>
+      <w:r>
+        <w:rPr>
+          <w:rFonts w:ascii="Times New Roman" w:hAnsi="Times New Roman" w:cs="Times New Roman"/>
+        </w:rPr>
+        <w:t xml:space="preserve">, with additional time left over. We kept on our predetermined schedule throughout the semester to ensure finishing on time. </w:t>
+      </w:r>
+      <w:r>
+        <w:rPr>
+          <w:rFonts w:ascii="Times New Roman" w:hAnsi="Times New Roman" w:cs="Times New Roman"/>
+        </w:rPr>
+        <w:t>While the final week will present it’s own challenges, our team is up for the task!</w:t>
+      </w:r>
     </w:p>
     <w:p>
       <w:pPr>
@@ -1938,7 +1956,7 @@
               <w:rPr>
                 <w:rFonts w:ascii="Times New Roman" w:hAnsi="Times New Roman" w:cs="Times New Roman"/>
               </w:rPr>
-              <w:t>3</w:t>
+              <w:t>4</w:t>
             </w:r>
             <w:r>
               <w:rPr>
@@ -1956,7 +1974,7 @@
               <w:rPr>
                 <w:rFonts w:ascii="Times New Roman" w:hAnsi="Times New Roman" w:cs="Times New Roman"/>
               </w:rPr>
-              <w:t>User Manual</w:t>
+              <w:t>Final Prep</w:t>
             </w:r>
           </w:p>
           <w:p>
@@ -2040,7 +2058,7 @@
               <w:rPr>
                 <w:rFonts w:ascii="Times New Roman" w:hAnsi="Times New Roman" w:cs="Times New Roman"/>
               </w:rPr>
-              <w:t>3</w:t>
+              <w:t>4</w:t>
             </w:r>
             <w:r>
               <w:rPr>
@@ -2088,7 +2106,13 @@
               <w:rPr>
                 <w:rFonts w:ascii="Times New Roman" w:hAnsi="Times New Roman" w:cs="Times New Roman"/>
               </w:rPr>
-              <w:t>, User Manual</w:t>
+              <w:t xml:space="preserve">, </w:t>
+            </w:r>
+            <w:r>
+              <w:rPr>
+                <w:rFonts w:ascii="Times New Roman" w:hAnsi="Times New Roman" w:cs="Times New Roman"/>
+              </w:rPr>
+              <w:t>Final Prep</w:t>
             </w:r>
           </w:p>
         </w:tc>
@@ -2170,7 +2194,7 @@
               <w:rPr>
                 <w:rFonts w:ascii="Times New Roman" w:hAnsi="Times New Roman" w:cs="Times New Roman"/>
               </w:rPr>
-              <w:t>3</w:t>
+              <w:t>4</w:t>
             </w:r>
             <w:r>
               <w:rPr>
@@ -2182,7 +2206,13 @@
               <w:rPr>
                 <w:rFonts w:ascii="Times New Roman" w:hAnsi="Times New Roman" w:cs="Times New Roman"/>
               </w:rPr>
-              <w:t>, User Manual</w:t>
+              <w:t xml:space="preserve">, </w:t>
+            </w:r>
+            <w:r>
+              <w:rPr>
+                <w:rFonts w:ascii="Times New Roman" w:hAnsi="Times New Roman" w:cs="Times New Roman"/>
+              </w:rPr>
+              <w:t>Final Prep</w:t>
             </w:r>
           </w:p>
         </w:tc>

</xml_diff>

<commit_message>
attempt to fix website
</commit_message>
<xml_diff>
--- a/Documentation/Weekly Report/week14/CMSC-4920-Week14Report-Group2.docx
+++ b/Documentation/Weekly Report/week14/CMSC-4920-Week14Report-Group2.docx
@@ -918,7 +918,7 @@
             </w:rPr>
             <w:fldChar w:fldCharType="separate"/>
           </w:r>
-          <w:hyperlink w:anchor="_Toc227228515" w:history="1">
+          <w:hyperlink w:anchor="_Toc227495226" w:history="1">
             <w:r>
               <w:rPr>
                 <w:rStyle w:val="Hyperlink"/>
@@ -956,7 +956,7 @@
                 <w:noProof/>
                 <w:webHidden/>
               </w:rPr>
-              <w:instrText xml:space="preserve"> PAGEREF _Toc227228515 \h </w:instrText>
+              <w:instrText xml:space="preserve"> PAGEREF _Toc227495226 \h </w:instrText>
             </w:r>
             <w:r>
               <w:rPr>
@@ -976,7 +976,7 @@
                 <w:noProof/>
                 <w:webHidden/>
               </w:rPr>
-              <w:t>1</w:t>
+              <w:t>2</w:t>
             </w:r>
             <w:r>
               <w:rPr>
@@ -998,7 +998,7 @@
               <w:noProof/>
             </w:rPr>
           </w:pPr>
-          <w:hyperlink w:anchor="_Toc227228516" w:history="1">
+          <w:hyperlink w:anchor="_Toc227495227" w:history="1">
             <w:r>
               <w:rPr>
                 <w:rStyle w:val="Hyperlink"/>
@@ -1028,7 +1028,7 @@
                 <w:noProof/>
                 <w:webHidden/>
               </w:rPr>
-              <w:instrText xml:space="preserve"> PAGEREF _Toc227228516 \h </w:instrText>
+              <w:instrText xml:space="preserve"> PAGEREF _Toc227495227 \h </w:instrText>
             </w:r>
             <w:r>
               <w:rPr>
@@ -1070,7 +1070,7 @@
               <w:noProof/>
             </w:rPr>
           </w:pPr>
-          <w:hyperlink w:anchor="_Toc227228517" w:history="1">
+          <w:hyperlink w:anchor="_Toc227495228" w:history="1">
             <w:r>
               <w:rPr>
                 <w:rStyle w:val="Hyperlink"/>
@@ -1100,7 +1100,7 @@
                 <w:noProof/>
                 <w:webHidden/>
               </w:rPr>
-              <w:instrText xml:space="preserve"> PAGEREF _Toc227228517 \h </w:instrText>
+              <w:instrText xml:space="preserve"> PAGEREF _Toc227495228 \h </w:instrText>
             </w:r>
             <w:r>
               <w:rPr>
@@ -1142,7 +1142,7 @@
               <w:noProof/>
             </w:rPr>
           </w:pPr>
-          <w:hyperlink w:anchor="_Toc227228518" w:history="1">
+          <w:hyperlink w:anchor="_Toc227495229" w:history="1">
             <w:r>
               <w:rPr>
                 <w:rStyle w:val="Hyperlink"/>
@@ -1172,7 +1172,7 @@
                 <w:noProof/>
                 <w:webHidden/>
               </w:rPr>
-              <w:instrText xml:space="preserve"> PAGEREF _Toc227228518 \h </w:instrText>
+              <w:instrText xml:space="preserve"> PAGEREF _Toc227495229 \h </w:instrText>
             </w:r>
             <w:r>
               <w:rPr>
@@ -1246,7 +1246,7 @@
           <w:szCs w:val="24"/>
         </w:rPr>
       </w:pPr>
-      <w:bookmarkStart w:id="0" w:name="_Toc227228515"/>
+      <w:bookmarkStart w:id="0" w:name="_Toc227495226"/>
       <w:r>
         <w:rPr>
           <w:rFonts w:ascii="Times New Roman" w:hAnsi="Times New Roman" w:cs="Times New Roman"/>
@@ -1351,7 +1351,21 @@
         <w:rPr>
           <w:rFonts w:ascii="Times New Roman" w:hAnsi="Times New Roman" w:cs="Times New Roman"/>
         </w:rPr>
-        <w:t>During our final week of progress, our team prepared for the upcoming Advisory Board meeting. This included final debugging, user manual pick up from print shop, and timed demonstration practices.</w:t>
+        <w:t xml:space="preserve">During our final week of progress, our team prepared for the upcoming Advisory Board meeting. This included final debugging, user manual </w:t>
+      </w:r>
+      <w:proofErr w:type="gramStart"/>
+      <w:r>
+        <w:rPr>
+          <w:rFonts w:ascii="Times New Roman" w:hAnsi="Times New Roman" w:cs="Times New Roman"/>
+        </w:rPr>
+        <w:t>pick</w:t>
+      </w:r>
+      <w:proofErr w:type="gramEnd"/>
+      <w:r>
+        <w:rPr>
+          <w:rFonts w:ascii="Times New Roman" w:hAnsi="Times New Roman" w:cs="Times New Roman"/>
+        </w:rPr>
+        <w:t xml:space="preserve"> up from print shop, and timed demonstration practices.</w:t>
       </w:r>
     </w:p>
     <w:p>
@@ -1366,7 +1380,7 @@
           <w:szCs w:val="24"/>
         </w:rPr>
       </w:pPr>
-      <w:bookmarkStart w:id="1" w:name="_Toc227228516"/>
+      <w:bookmarkStart w:id="1" w:name="_Toc227495227"/>
       <w:r>
         <w:rPr>
           <w:rFonts w:ascii="Times New Roman" w:hAnsi="Times New Roman" w:cs="Times New Roman"/>
@@ -1743,7 +1757,7 @@
           <w:szCs w:val="24"/>
         </w:rPr>
       </w:pPr>
-      <w:bookmarkStart w:id="2" w:name="_Toc227228517"/>
+      <w:bookmarkStart w:id="2" w:name="_Toc227495228"/>
       <w:r>
         <w:rPr>
           <w:rFonts w:ascii="Times New Roman" w:hAnsi="Times New Roman" w:cs="Times New Roman"/>
@@ -1759,15 +1773,15 @@
       <w:bookmarkEnd w:id="2"/>
     </w:p>
     <w:p>
-      <w:r>
-        <w:rPr>
-          <w:noProof/>
-        </w:rPr>
+      <w:pPr>
+        <w:jc w:val="center"/>
+      </w:pPr>
+      <w:r>
         <w:drawing>
-          <wp:inline distT="0" distB="0" distL="0" distR="0" wp14:anchorId="5E59224A" wp14:editId="5AC37B4F">
-            <wp:extent cx="5943600" cy="2834005"/>
-            <wp:effectExtent l="19050" t="19050" r="19050" b="23495"/>
-            <wp:docPr id="155236164" name="Picture 1"/>
+          <wp:inline distT="0" distB="0" distL="0" distR="0" wp14:anchorId="1A293C46" wp14:editId="13BB1A64">
+            <wp:extent cx="5943600" cy="2656840"/>
+            <wp:effectExtent l="19050" t="19050" r="19050" b="10160"/>
+            <wp:docPr id="1137288874" name="Picture 1"/>
             <wp:cNvGraphicFramePr>
               <a:graphicFrameLocks xmlns:a="http://schemas.openxmlformats.org/drawingml/2006/main" noChangeAspect="1"/>
             </wp:cNvGraphicFramePr>
@@ -1775,7 +1789,7 @@
               <a:graphicData uri="http://schemas.openxmlformats.org/drawingml/2006/picture">
                 <pic:pic xmlns:pic="http://schemas.openxmlformats.org/drawingml/2006/picture">
                   <pic:nvPicPr>
-                    <pic:cNvPr id="155236164" name=""/>
+                    <pic:cNvPr id="1137288874" name=""/>
                     <pic:cNvPicPr/>
                   </pic:nvPicPr>
                   <pic:blipFill>
@@ -1787,7 +1801,7 @@
                   <pic:spPr>
                     <a:xfrm>
                       <a:off x="0" y="0"/>
-                      <a:ext cx="5943600" cy="2834005"/>
+                      <a:ext cx="5943600" cy="2656840"/>
                     </a:xfrm>
                     <a:prstGeom prst="rect">
                       <a:avLst/>
@@ -1819,7 +1833,7 @@
           <w:szCs w:val="24"/>
         </w:rPr>
       </w:pPr>
-      <w:bookmarkStart w:id="3" w:name="_Toc227228518"/>
+      <w:bookmarkStart w:id="3" w:name="_Toc227495229"/>
       <w:r>
         <w:rPr>
           <w:rFonts w:ascii="Times New Roman" w:hAnsi="Times New Roman" w:cs="Times New Roman"/>

</xml_diff>